<commit_message>
Adding Jilba Metrics Counter for Rust code
</commit_message>
<xml_diff>
--- a/Гавлев_Джалилова_Отчёт.docx
+++ b/Гавлев_Джалилова_Отчёт.docx
@@ -463,7 +463,6 @@
           <w:szCs w:val="28"/>
         </w:rPr>
       </w:pPr>
-      <w:proofErr w:type="gramStart"/>
       <w:r>
         <w:rPr>
           <w:rFonts w:cs="Times New Roman"/>
@@ -483,15 +482,7 @@
           <w:rFonts w:cs="Times New Roman"/>
           <w:szCs w:val="28"/>
         </w:rPr>
-        <w:t xml:space="preserve">:   </w:t>
-      </w:r>
-      <w:proofErr w:type="gramEnd"/>
-      <w:r>
-        <w:rPr>
-          <w:rFonts w:cs="Times New Roman"/>
-          <w:szCs w:val="28"/>
-        </w:rPr>
-        <w:t xml:space="preserve">                              </w:t>
+        <w:t xml:space="preserve">:                                 </w:t>
       </w:r>
       <w:r>
         <w:rPr>
@@ -726,7 +717,6 @@
           <w:szCs w:val="28"/>
         </w:rPr>
       </w:pPr>
-      <w:proofErr w:type="gramStart"/>
       <w:r>
         <w:rPr>
           <w:rFonts w:cs="Times New Roman"/>
@@ -748,7 +738,6 @@
         </w:rPr>
         <w:tab/>
       </w:r>
-      <w:proofErr w:type="gramEnd"/>
       <w:r>
         <w:rPr>
           <w:rFonts w:cs="Times New Roman"/>
@@ -1009,15 +998,7 @@
         <w:ind w:firstLine="567"/>
       </w:pPr>
       <w:r>
-        <w:t xml:space="preserve">Абсолютная сложность по метрике Джилба </w:t>
-      </w:r>
-      <w:proofErr w:type="gramStart"/>
-      <w:r>
-        <w:t>- это</w:t>
-      </w:r>
-      <w:proofErr w:type="gramEnd"/>
-      <w:r>
-        <w:t xml:space="preserve"> сумма всех ветвлений (операторы условия, циклы, операторы множественного выбора). </w:t>
+        <w:t xml:space="preserve">Абсолютная сложность по метрике Джилба - это сумма всех ветвлений (операторы условия, циклы, операторы множественного выбора). </w:t>
       </w:r>
     </w:p>
     <w:p>
@@ -1099,28 +1080,14 @@
         <w:rPr>
           <w:lang w:val="en-US"/>
         </w:rPr>
-        <w:t>calculate_</w:t>
-      </w:r>
-      <w:proofErr w:type="gramStart"/>
-      <w:r>
-        <w:rPr>
-          <w:lang w:val="en-US"/>
-        </w:rPr>
-        <w:t>score</w:t>
+        <w:t>calculate_score</w:t>
       </w:r>
       <w:proofErr w:type="spellEnd"/>
       <w:r>
         <w:rPr>
           <w:lang w:val="en-US"/>
         </w:rPr>
-        <w:t>(</w:t>
-      </w:r>
-      <w:proofErr w:type="gramEnd"/>
-      <w:r>
-        <w:rPr>
-          <w:lang w:val="en-US"/>
-        </w:rPr>
-        <w:t>values: &amp;[i32]) -&gt; i32 {</w:t>
+        <w:t>(values: &amp;[i32]) -&gt; i32 {</w:t>
       </w:r>
     </w:p>
     <w:p>
@@ -1179,7 +1146,6 @@
         <w:t xml:space="preserve">        if index &gt;= </w:t>
       </w:r>
       <w:proofErr w:type="spellStart"/>
-      <w:proofErr w:type="gramStart"/>
       <w:r>
         <w:rPr>
           <w:lang w:val="en-US"/>
@@ -1191,14 +1157,7 @@
         <w:rPr>
           <w:lang w:val="en-US"/>
         </w:rPr>
-        <w:t>(</w:t>
-      </w:r>
-      <w:proofErr w:type="gramEnd"/>
-      <w:r>
-        <w:rPr>
-          <w:lang w:val="en-US"/>
-        </w:rPr>
-        <w:t>) {</w:t>
+        <w:t>() {</w:t>
       </w:r>
     </w:p>
     <w:p>
@@ -1299,7 +1258,6 @@
         <w:t xml:space="preserve">            score -= </w:t>
       </w:r>
       <w:proofErr w:type="spellStart"/>
-      <w:proofErr w:type="gramStart"/>
       <w:r>
         <w:rPr>
           <w:lang w:val="en-US"/>
@@ -1311,14 +1269,7 @@
         <w:rPr>
           <w:lang w:val="en-US"/>
         </w:rPr>
-        <w:t>(</w:t>
-      </w:r>
-      <w:proofErr w:type="gramEnd"/>
-      <w:r>
-        <w:rPr>
-          <w:lang w:val="en-US"/>
-        </w:rPr>
-        <w:t>);</w:t>
+        <w:t>();</w:t>
       </w:r>
     </w:p>
     <w:p>
@@ -1438,21 +1389,7 @@
         <w:rPr>
           <w:lang w:val="en-US"/>
         </w:rPr>
-        <w:t xml:space="preserve"> </w:t>
-      </w:r>
-      <w:proofErr w:type="gramStart"/>
-      <w:r>
-        <w:rPr>
-          <w:lang w:val="en-US"/>
-        </w:rPr>
-        <w:t>classify(</w:t>
-      </w:r>
-      <w:proofErr w:type="gramEnd"/>
-      <w:r>
-        <w:rPr>
-          <w:lang w:val="en-US"/>
-        </w:rPr>
-        <w:t>value: i32) -&gt; &amp;'static str {</w:t>
+        <w:t xml:space="preserve"> classify(value: i32) -&gt; &amp;'static str {</w:t>
       </w:r>
     </w:p>
     <w:p>
@@ -1587,21 +1524,7 @@
         <w:rPr>
           <w:lang w:val="en-US"/>
         </w:rPr>
-        <w:t xml:space="preserve"> </w:t>
-      </w:r>
-      <w:proofErr w:type="gramStart"/>
-      <w:r>
-        <w:rPr>
-          <w:lang w:val="en-US"/>
-        </w:rPr>
-        <w:t>process(</w:t>
-      </w:r>
-      <w:proofErr w:type="gramEnd"/>
-      <w:r>
-        <w:rPr>
-          <w:lang w:val="en-US"/>
-        </w:rPr>
-        <w:t>values: &amp;[i32]) -&gt; i32 {</w:t>
+        <w:t xml:space="preserve"> process(values: &amp;[i32]) -&gt; i32 {</w:t>
       </w:r>
     </w:p>
     <w:p>
@@ -1716,7 +1639,6 @@
         <w:t xml:space="preserve">    while counter &lt; </w:t>
       </w:r>
       <w:proofErr w:type="spellStart"/>
-      <w:proofErr w:type="gramStart"/>
       <w:r>
         <w:rPr>
           <w:lang w:val="en-US"/>
@@ -1728,14 +1650,7 @@
         <w:rPr>
           <w:lang w:val="en-US"/>
         </w:rPr>
-        <w:t>(</w:t>
-      </w:r>
-      <w:proofErr w:type="gramEnd"/>
-      <w:r>
-        <w:rPr>
-          <w:lang w:val="en-US"/>
-        </w:rPr>
-        <w:t>) {</w:t>
+        <w:t>() {</w:t>
       </w:r>
     </w:p>
     <w:p>
@@ -2003,21 +1918,7 @@
         <w:rPr>
           <w:lang w:val="en-US"/>
         </w:rPr>
-        <w:t xml:space="preserve">        for _ in </w:t>
-      </w:r>
-      <w:proofErr w:type="gramStart"/>
-      <w:r>
-        <w:rPr>
-          <w:lang w:val="en-US"/>
-        </w:rPr>
-        <w:t>0..</w:t>
-      </w:r>
-      <w:proofErr w:type="gramEnd"/>
-      <w:r>
-        <w:rPr>
-          <w:lang w:val="en-US"/>
-        </w:rPr>
-        <w:t>1 {</w:t>
+        <w:t xml:space="preserve">        for _ in 0..1 {</w:t>
       </w:r>
     </w:p>
     <w:p>
@@ -2306,21 +2207,7 @@
         <w:rPr>
           <w:lang w:val="en-US"/>
         </w:rPr>
-        <w:t xml:space="preserve"> </w:t>
-      </w:r>
-      <w:proofErr w:type="gramStart"/>
-      <w:r>
-        <w:rPr>
-          <w:lang w:val="en-US"/>
-        </w:rPr>
-        <w:t>main(</w:t>
-      </w:r>
-      <w:proofErr w:type="gramEnd"/>
-      <w:r>
-        <w:rPr>
-          <w:lang w:val="en-US"/>
-        </w:rPr>
-        <w:t>) {</w:t>
+        <w:t xml:space="preserve"> main() {</w:t>
       </w:r>
     </w:p>
     <w:p>
@@ -2337,7 +2224,6 @@
         <w:t xml:space="preserve">    let values = </w:t>
       </w:r>
       <w:proofErr w:type="spellStart"/>
-      <w:proofErr w:type="gramStart"/>
       <w:r>
         <w:rPr>
           <w:lang w:val="en-US"/>
@@ -2349,14 +2235,7 @@
         <w:rPr>
           <w:lang w:val="en-US"/>
         </w:rPr>
-        <w:t>![</w:t>
-      </w:r>
-      <w:proofErr w:type="gramEnd"/>
-      <w:r>
-        <w:rPr>
-          <w:lang w:val="en-US"/>
-        </w:rPr>
-        <w:t>0, 1, 2, 5, 10, 15];</w:t>
+        <w:t>![0, 1, 2, 5, 10, 15];</w:t>
       </w:r>
     </w:p>
     <w:p>
@@ -2415,7 +2294,6 @@
         <w:t xml:space="preserve">    </w:t>
       </w:r>
       <w:proofErr w:type="spellStart"/>
-      <w:proofErr w:type="gramStart"/>
       <w:r>
         <w:rPr>
           <w:lang w:val="en-US"/>
@@ -2427,14 +2305,7 @@
         <w:rPr>
           <w:lang w:val="en-US"/>
         </w:rPr>
-        <w:t>!(</w:t>
-      </w:r>
-      <w:proofErr w:type="gramEnd"/>
-      <w:r>
-        <w:rPr>
-          <w:lang w:val="en-US"/>
-        </w:rPr>
-        <w:t>"Score: {}", score);</w:t>
+        <w:t>!("Score: {}", score);</w:t>
       </w:r>
     </w:p>
     <w:p>
@@ -2451,7 +2322,6 @@
         <w:t xml:space="preserve">    </w:t>
       </w:r>
       <w:proofErr w:type="spellStart"/>
-      <w:proofErr w:type="gramStart"/>
       <w:r>
         <w:rPr>
           <w:lang w:val="en-US"/>
@@ -2463,14 +2333,7 @@
         <w:rPr>
           <w:lang w:val="en-US"/>
         </w:rPr>
-        <w:t>!(</w:t>
-      </w:r>
-      <w:proofErr w:type="gramEnd"/>
-      <w:r>
-        <w:rPr>
-          <w:lang w:val="en-US"/>
-        </w:rPr>
-        <w:t>"Result: {}", result);</w:t>
+        <w:t>!("Result: {}", result);</w:t>
       </w:r>
     </w:p>
     <w:p>
@@ -2501,7 +2364,6 @@
         <w:t xml:space="preserve">        </w:t>
       </w:r>
       <w:proofErr w:type="spellStart"/>
-      <w:proofErr w:type="gramStart"/>
       <w:r>
         <w:rPr>
           <w:lang w:val="en-US"/>
@@ -2513,14 +2375,7 @@
         <w:rPr>
           <w:lang w:val="en-US"/>
         </w:rPr>
-        <w:t>!(</w:t>
-      </w:r>
-      <w:proofErr w:type="gramEnd"/>
-      <w:r>
-        <w:rPr>
-          <w:lang w:val="en-US"/>
-        </w:rPr>
-        <w:t>"{} -&gt; {}", value, classify(*value));</w:t>
+        <w:t>!("{} -&gt; {}", value, classify(*value));</w:t>
       </w:r>
     </w:p>
     <w:p>
@@ -2997,6 +2852,65 @@
           <w:szCs w:val="28"/>
         </w:rPr>
         <w:t>.</w:t>
+      </w:r>
+    </w:p>
+    <w:p>
+      <w:pPr>
+        <w:spacing w:line="240" w:lineRule="auto"/>
+        <w:rPr>
+          <w:rFonts w:eastAsia="Times New Roman" w:cs="Times New Roman"/>
+          <w:szCs w:val="28"/>
+        </w:rPr>
+      </w:pPr>
+    </w:p>
+    <w:p>
+      <w:pPr>
+        <w:spacing w:line="240" w:lineRule="auto"/>
+        <w:rPr>
+          <w:rFonts w:eastAsia="Times New Roman" w:cs="Times New Roman"/>
+          <w:szCs w:val="28"/>
+        </w:rPr>
+      </w:pPr>
+      <w:r>
+        <w:rPr>
+          <w:rFonts w:eastAsia="Times New Roman" w:cs="Times New Roman"/>
+          <w:szCs w:val="28"/>
+        </w:rPr>
+        <w:drawing>
+          <wp:inline distT="0" distB="0" distL="0" distR="0" wp14:anchorId="68A047B0" wp14:editId="2EE7E233">
+            <wp:extent cx="5939790" cy="1282700"/>
+            <wp:effectExtent l="0" t="0" r="3810" b="0"/>
+            <wp:docPr id="1" name="Рисунок 1"/>
+            <wp:cNvGraphicFramePr>
+              <a:graphicFrameLocks xmlns:a="http://schemas.openxmlformats.org/drawingml/2006/main" noChangeAspect="1"/>
+            </wp:cNvGraphicFramePr>
+            <a:graphic xmlns:a="http://schemas.openxmlformats.org/drawingml/2006/main">
+              <a:graphicData uri="http://schemas.openxmlformats.org/drawingml/2006/picture">
+                <pic:pic xmlns:pic="http://schemas.openxmlformats.org/drawingml/2006/picture">
+                  <pic:nvPicPr>
+                    <pic:cNvPr id="1" name=""/>
+                    <pic:cNvPicPr/>
+                  </pic:nvPicPr>
+                  <pic:blipFill>
+                    <a:blip r:embed="rId5"/>
+                    <a:stretch>
+                      <a:fillRect/>
+                    </a:stretch>
+                  </pic:blipFill>
+                  <pic:spPr>
+                    <a:xfrm>
+                      <a:off x="0" y="0"/>
+                      <a:ext cx="5939790" cy="1282700"/>
+                    </a:xfrm>
+                    <a:prstGeom prst="rect">
+                      <a:avLst/>
+                    </a:prstGeom>
+                  </pic:spPr>
+                </pic:pic>
+              </a:graphicData>
+            </a:graphic>
+          </wp:inline>
+        </w:drawing>
       </w:r>
     </w:p>
     <w:p>

</xml_diff>